<commit_message>
Feat: Actualización semana 3
</commit_message>
<xml_diff>
--- a/FTCOES-264 Pacto Pedagógico-nuevas-tecnologías.docx
+++ b/FTCOES-264 Pacto Pedagógico-nuevas-tecnologías.docx
@@ -351,8 +351,8 @@
         <w:tblLook w:val="04A0" w:firstRow="1" w:lastRow="0" w:firstColumn="1" w:lastColumn="0" w:noHBand="0" w:noVBand="1"/>
       </w:tblPr>
       <w:tblGrid>
-        <w:gridCol w:w="1691"/>
-        <w:gridCol w:w="8221"/>
+        <w:gridCol w:w="1690"/>
+        <w:gridCol w:w="8222"/>
       </w:tblGrid>
       <w:tr>
         <w:tc>
@@ -390,6 +390,14 @@
                 <w:bCs/>
               </w:rPr>
             </w:pPr>
+            <w:r>
+              <w:rPr>
+                <w:rFonts w:ascii="Arial" w:hAnsi="Arial" w:cs="Arial"/>
+                <w:b/>
+                <w:bCs/>
+              </w:rPr>
+              <w:t>Técnico Desarrollo de Software</w:t>
+            </w:r>
           </w:p>
         </w:tc>
       </w:tr>
@@ -429,6 +437,14 @@
                 <w:bCs/>
               </w:rPr>
             </w:pPr>
+            <w:r>
+              <w:rPr>
+                <w:rFonts w:ascii="Arial" w:hAnsi="Arial" w:cs="Arial"/>
+                <w:b/>
+                <w:bCs/>
+              </w:rPr>
+              <w:t>3</w:t>
+            </w:r>
           </w:p>
         </w:tc>
       </w:tr>
@@ -468,6 +484,14 @@
                 <w:bCs/>
               </w:rPr>
             </w:pPr>
+            <w:r>
+              <w:rPr>
+                <w:rFonts w:ascii="Arial" w:hAnsi="Arial" w:cs="Arial"/>
+                <w:b/>
+                <w:bCs/>
+              </w:rPr>
+              <w:t>Nuevas Tecnologías</w:t>
+            </w:r>
           </w:p>
         </w:tc>
       </w:tr>
@@ -512,6 +536,14 @@
                 <w:bCs/>
               </w:rPr>
             </w:pPr>
+            <w:r>
+              <w:rPr>
+                <w:rFonts w:ascii="Arial" w:hAnsi="Arial" w:cs="Arial"/>
+                <w:b/>
+                <w:bCs/>
+              </w:rPr>
+              <w:t>Santiago Yosa</w:t>
+            </w:r>
           </w:p>
         </w:tc>
       </w:tr>
@@ -551,6 +583,14 @@
                 <w:bCs/>
               </w:rPr>
             </w:pPr>
+            <w:r>
+              <w:rPr>
+                <w:rFonts w:ascii="Arial" w:hAnsi="Arial" w:cs="Arial"/>
+                <w:b/>
+                <w:bCs/>
+              </w:rPr>
+              <w:t>Mañana</w:t>
+            </w:r>
           </w:p>
         </w:tc>
       </w:tr>
@@ -590,6 +630,14 @@
                 <w:bCs/>
               </w:rPr>
             </w:pPr>
+            <w:r>
+              <w:rPr>
+                <w:rFonts w:ascii="Arial" w:hAnsi="Arial" w:cs="Arial"/>
+                <w:b/>
+                <w:bCs/>
+              </w:rPr>
+              <w:t>9:00 am – 12:00 m</w:t>
+            </w:r>
           </w:p>
         </w:tc>
       </w:tr>
@@ -2420,34 +2468,7 @@
           <w:sz w:val="22"/>
           <w:szCs w:val="22"/>
         </w:rPr>
-        <w:t>10</w:t>
-      </w:r>
-      <w:r>
-        <w:rPr>
-          <w:rFonts w:ascii="Arial" w:hAnsi="Arial" w:cs="Arial"/>
-          <w:bCs/>
-          <w:sz w:val="22"/>
-          <w:szCs w:val="22"/>
-        </w:rPr>
-        <w:t>:</w:t>
-      </w:r>
-      <w:r>
-        <w:rPr>
-          <w:rFonts w:ascii="Arial" w:hAnsi="Arial" w:cs="Arial"/>
-          <w:bCs/>
-          <w:sz w:val="22"/>
-          <w:szCs w:val="22"/>
-        </w:rPr>
-        <w:t>3</w:t>
-      </w:r>
-      <w:r>
-        <w:rPr>
-          <w:rFonts w:ascii="Arial" w:hAnsi="Arial" w:cs="Arial"/>
-          <w:bCs/>
-          <w:sz w:val="22"/>
-          <w:szCs w:val="22"/>
-        </w:rPr>
-        <w:t>0 am</w:t>
+        <w:t>10:30 am</w:t>
       </w:r>
     </w:p>
     <w:p>
@@ -3144,6 +3165,13 @@
                 <w:lang w:val="es"/>
               </w:rPr>
             </w:pPr>
+            <w:r>
+              <w:rPr>
+                <w:rFonts w:ascii="Arial" w:eastAsia="Arial" w:hAnsi="Arial" w:cs="Arial"/>
+                <w:lang w:val="es"/>
+              </w:rPr>
+              <w:t>06/03/2026</w:t>
+            </w:r>
           </w:p>
         </w:tc>
       </w:tr>
@@ -3229,6 +3257,15 @@
                 <w:szCs w:val="24"/>
               </w:rPr>
             </w:pPr>
+            <w:r>
+              <w:rPr>
+                <w:rFonts w:ascii="Aptos" w:eastAsia="Aptos" w:hAnsi="Aptos" w:cs="Aptos"/>
+                <w:color w:val="000000" w:themeColor="text1"/>
+                <w:sz w:val="24"/>
+                <w:szCs w:val="24"/>
+              </w:rPr>
+              <w:t>24/04/2026</w:t>
+            </w:r>
           </w:p>
         </w:tc>
       </w:tr>
@@ -3313,6 +3350,15 @@
                 <w:szCs w:val="24"/>
               </w:rPr>
             </w:pPr>
+            <w:r>
+              <w:rPr>
+                <w:rFonts w:ascii="Aptos" w:eastAsia="Aptos" w:hAnsi="Aptos" w:cs="Aptos"/>
+                <w:color w:val="000000" w:themeColor="text1"/>
+                <w:sz w:val="24"/>
+                <w:szCs w:val="24"/>
+              </w:rPr>
+              <w:t>29/05/2026</w:t>
+            </w:r>
           </w:p>
         </w:tc>
       </w:tr>
@@ -11980,6 +12026,23 @@
 </file>
 
 <file path=customXml/item2.xml><?xml version="1.0" encoding="utf-8"?>
+<p:properties xmlns:p="http://schemas.microsoft.com/office/2006/metadata/properties" xmlns:xsi="http://www.w3.org/2001/XMLSchema-instance" xmlns:pc="http://schemas.microsoft.com/office/infopath/2007/PartnerControls">
+  <documentManagement>
+    <_ip_UnifiedCompliancePolicyUIAction xmlns="http://schemas.microsoft.com/sharepoint/v3" xsi:nil="true"/>
+    <_ip_UnifiedCompliancePolicyProperties xmlns="http://schemas.microsoft.com/sharepoint/v3" xsi:nil="true"/>
+    <lcf76f155ced4ddcb4097134ff3c332f xmlns="7b561a7d-03ef-46ce-a41e-e61301d113cb">
+      <Terms xmlns="http://schemas.microsoft.com/office/infopath/2007/PartnerControls"/>
+    </lcf76f155ced4ddcb4097134ff3c332f>
+    <TaxCatchAll xmlns="994143d1-a46e-4cdc-b40f-bf94aa6cf9c8" xsi:nil="true"/>
+  </documentManagement>
+</p:properties>
+</file>
+
+<file path=customXml/item3.xml><?xml version="1.0" encoding="utf-8"?>
+<b:Sources xmlns:b="http://schemas.openxmlformats.org/officeDocument/2006/bibliography" xmlns="http://schemas.openxmlformats.org/officeDocument/2006/bibliography" SelectedStyle="\APASixthEditionOfficeOnline.xsl" StyleName="APA" Version="6"/>
+</file>
+
+<file path=customXml/item4.xml><?xml version="1.0" encoding="utf-8"?>
 <ct:contentTypeSchema xmlns:ct="http://schemas.microsoft.com/office/2006/metadata/contentType" xmlns:ma="http://schemas.microsoft.com/office/2006/metadata/properties/metaAttributes" ct:_="" ma:_="" ma:contentTypeName="Documento" ma:contentTypeID="0x010100B8B5F4945050EE44A7FD4E7B700747A9" ma:contentTypeVersion="14" ma:contentTypeDescription="Crear nuevo documento." ma:contentTypeScope="" ma:versionID="f1cf06722fd3159f2b0157ce91b5fa57">
   <xsd:schema xmlns:xsd="http://www.w3.org/2001/XMLSchema" xmlns:xs="http://www.w3.org/2001/XMLSchema" xmlns:p="http://schemas.microsoft.com/office/2006/metadata/properties" xmlns:ns1="http://schemas.microsoft.com/sharepoint/v3" xmlns:ns2="7b561a7d-03ef-46ce-a41e-e61301d113cb" xmlns:ns3="994143d1-a46e-4cdc-b40f-bf94aa6cf9c8" targetNamespace="http://schemas.microsoft.com/office/2006/metadata/properties" ma:root="true" ma:fieldsID="7facff62a406a26432f8c785449f14bc" ns1:_="" ns2:_="" ns3:_="">
     <xsd:import namespace="http://schemas.microsoft.com/sharepoint/v3"/>
@@ -12195,23 +12258,6 @@
 </ct:contentTypeSchema>
 </file>
 
-<file path=customXml/item3.xml><?xml version="1.0" encoding="utf-8"?>
-<b:Sources xmlns:b="http://schemas.openxmlformats.org/officeDocument/2006/bibliography" xmlns="http://schemas.openxmlformats.org/officeDocument/2006/bibliography" SelectedStyle="\APASixthEditionOfficeOnline.xsl" StyleName="APA" Version="6"/>
-</file>
-
-<file path=customXml/item4.xml><?xml version="1.0" encoding="utf-8"?>
-<p:properties xmlns:p="http://schemas.microsoft.com/office/2006/metadata/properties" xmlns:xsi="http://www.w3.org/2001/XMLSchema-instance" xmlns:pc="http://schemas.microsoft.com/office/infopath/2007/PartnerControls">
-  <documentManagement>
-    <_ip_UnifiedCompliancePolicyUIAction xmlns="http://schemas.microsoft.com/sharepoint/v3" xsi:nil="true"/>
-    <_ip_UnifiedCompliancePolicyProperties xmlns="http://schemas.microsoft.com/sharepoint/v3" xsi:nil="true"/>
-    <lcf76f155ced4ddcb4097134ff3c332f xmlns="7b561a7d-03ef-46ce-a41e-e61301d113cb">
-      <Terms xmlns="http://schemas.microsoft.com/office/infopath/2007/PartnerControls"/>
-    </lcf76f155ced4ddcb4097134ff3c332f>
-    <TaxCatchAll xmlns="994143d1-a46e-4cdc-b40f-bf94aa6cf9c8" xsi:nil="true"/>
-  </documentManagement>
-</p:properties>
-</file>
-
 <file path=customXml/itemProps1.xml><?xml version="1.0" encoding="utf-8"?>
 <ds:datastoreItem xmlns:ds="http://schemas.openxmlformats.org/officeDocument/2006/customXml" ds:itemID="{1A078964-D09C-44B4-8577-FC6AF74D9725}">
   <ds:schemaRefs>
@@ -12221,6 +12267,26 @@
 </file>
 
 <file path=customXml/itemProps2.xml><?xml version="1.0" encoding="utf-8"?>
+<ds:datastoreItem xmlns:ds="http://schemas.openxmlformats.org/officeDocument/2006/customXml" ds:itemID="{B6FB8993-579F-4DED-9164-261DF16F17BC}">
+  <ds:schemaRefs>
+    <ds:schemaRef ds:uri="http://schemas.microsoft.com/office/2006/metadata/properties"/>
+    <ds:schemaRef ds:uri="http://schemas.microsoft.com/office/infopath/2007/PartnerControls"/>
+    <ds:schemaRef ds:uri="http://schemas.microsoft.com/sharepoint/v3"/>
+    <ds:schemaRef ds:uri="7b561a7d-03ef-46ce-a41e-e61301d113cb"/>
+    <ds:schemaRef ds:uri="994143d1-a46e-4cdc-b40f-bf94aa6cf9c8"/>
+  </ds:schemaRefs>
+</ds:datastoreItem>
+</file>
+
+<file path=customXml/itemProps3.xml><?xml version="1.0" encoding="utf-8"?>
+<ds:datastoreItem xmlns:ds="http://schemas.openxmlformats.org/officeDocument/2006/customXml" ds:itemID="{719C53C8-6477-46F0-91B2-9F1066145A2E}">
+  <ds:schemaRefs>
+    <ds:schemaRef ds:uri="http://schemas.openxmlformats.org/officeDocument/2006/bibliography"/>
+  </ds:schemaRefs>
+</ds:datastoreItem>
+</file>
+
+<file path=customXml/itemProps4.xml><?xml version="1.0" encoding="utf-8"?>
 <ds:datastoreItem xmlns:ds="http://schemas.openxmlformats.org/officeDocument/2006/customXml" ds:itemID="{EB4D64C5-D144-4ACA-98DF-DE47960D8990}">
   <ds:schemaRefs>
     <ds:schemaRef ds:uri="http://schemas.microsoft.com/office/2006/metadata/contentType"/>
@@ -12238,24 +12304,4 @@
     <ds:schemaRef ds:uri="http://schemas.microsoft.com/internal/obd"/>
   </ds:schemaRefs>
 </ds:datastoreItem>
-</file>
-
-<file path=customXml/itemProps3.xml><?xml version="1.0" encoding="utf-8"?>
-<ds:datastoreItem xmlns:ds="http://schemas.openxmlformats.org/officeDocument/2006/customXml" ds:itemID="{719C53C8-6477-46F0-91B2-9F1066145A2E}">
-  <ds:schemaRefs>
-    <ds:schemaRef ds:uri="http://schemas.openxmlformats.org/officeDocument/2006/bibliography"/>
-  </ds:schemaRefs>
-</ds:datastoreItem>
-</file>
-
-<file path=customXml/itemProps4.xml><?xml version="1.0" encoding="utf-8"?>
-<ds:datastoreItem xmlns:ds="http://schemas.openxmlformats.org/officeDocument/2006/customXml" ds:itemID="{B6FB8993-579F-4DED-9164-261DF16F17BC}">
-  <ds:schemaRefs>
-    <ds:schemaRef ds:uri="http://schemas.microsoft.com/office/2006/metadata/properties"/>
-    <ds:schemaRef ds:uri="http://schemas.microsoft.com/office/infopath/2007/PartnerControls"/>
-    <ds:schemaRef ds:uri="http://schemas.microsoft.com/sharepoint/v3"/>
-    <ds:schemaRef ds:uri="7b561a7d-03ef-46ce-a41e-e61301d113cb"/>
-    <ds:schemaRef ds:uri="994143d1-a46e-4cdc-b40f-bf94aa6cf9c8"/>
-  </ds:schemaRefs>
-</ds:datastoreItem>
 </file>
</xml_diff>